<commit_message>
chore: update SME reference documents
</commit_message>
<xml_diff>
--- a/public/SME Documents/Comprehensive_Pricing_Strategy_AI-Powered_eLearning_Course_Builder.docx
+++ b/public/SME Documents/Comprehensive_Pricing_Strategy_AI-Powered_eLearning_Course_Builder.docx
@@ -48,7 +48,7 @@
         <w:t xml:space="preserve">Date:</w:t>
       </w:r>
       <w:r>
-        <w:t xml:space="preserve"> March 21, 2026</w:t>
+        <w:t xml:space="preserve"> April 19, 2026</w:t>
       </w:r>
     </w:p>
     <w:p>
@@ -71,7 +71,7 @@
         <w:pStyle w:val="MdParagraph"/>
       </w:pPr>
       <w:r>
-        <w:t xml:space="preserve">This document presents an updated, comprehensive pricing strategy for an AI-powered eLearning course builder that serves two distinct markets: corporate instructional designers (IDs) and K-12 educators. The original strategy successfully established a hybrid subscription-plus-credit model designed to abstract the variable costs of AI generation while capturing value from high-volume corporate users. However, expanding into the K-12 market requires a fundamental shift in pricing architecture. </w:t>
+        <w:t xml:space="preserve">This document presents an updated, comprehensive pricing strategy for an AI-powered eLearning course builder that serves two distinct markets: corporate instructional designers (IDs) and K-12 educators. The original strategy successfully established a hybrid subscription-plus-credit model designed to abstract the variable costs of AI generation while capturing value from high-volume corporate users. The introduction of high-quality Text-to-Speech (TTS) audio narration—a premium feature with significant API costs—requires a recalibration of the credit system and tier benefits to maintain profitability while maximizing user adoption.</w:t>
       </w:r>
     </w:p>
     <w:p>
@@ -85,7 +85,7 @@
         <w:pStyle w:val="MdParagraph"/>
       </w:pPr>
       <w:r>
-        <w:t xml:space="preserve">Corporate buyers are accustomed to high per-seat licensing and prioritize ROI, time-saving efficiency, and SCORM compliance. In contrast, the K-12 market is highly price-sensitive, relies heavily on a "freemium" adoption funnel where individual teachers advocate for district-wide purchases, and operates within rigid annual budget cycles [1] [2]. </w:t>
+        <w:t xml:space="preserve">Corporate buyers are accustomed to high per-seat licensing and prioritize ROI, time-saving efficiency, SCORM compliance, and now, professional-grade audio narration without the need for voice actors. In contrast, the K-12 market is highly price-sensitive, relies heavily on a "freemium" adoption funnel where individual teachers advocate for district-wide purchases, and operates within rigid annual budget cycles [1] [2]. </w:t>
       </w:r>
     </w:p>
     <w:p>
@@ -99,7 +99,7 @@
         <w:pStyle w:val="MdParagraph"/>
       </w:pPr>
       <w:r>
-        <w:t xml:space="preserve">To successfully capture both markets without cannibalizing revenue, the optimal approach is a </w:t>
+        <w:t xml:space="preserve">To successfully capture both markets without cannibalizing revenue, the optimal approach remains a </w:t>
       </w:r>
       <w:r>
         <w:rPr>
@@ -110,7 +110,7 @@
         <w:t xml:space="preserve">Bifurcated Tiered Subscription Model</w:t>
       </w:r>
       <w:r>
-        <w:t xml:space="preserve"> built on a unified credit system. This strategy maintains the high-value corporate tiers from the original plan while introducing an aggressively priced, highly accessible "Education Track" that leverages freemium mechanics to drive district-level enterprise sales.</w:t>
+        <w:t xml:space="preserve"> built on a unified credit system. This updated strategy integrates TTS audio generation as a high-value, credit-intensive feature, positioning it as a key differentiator for premium tiers and a driver for credit pack upsells.</w:t>
       </w:r>
     </w:p>
     <w:p>
@@ -142,7 +142,7 @@
         <w:pStyle w:val="MdParagraph"/>
       </w:pPr>
       <w:r>
-        <w:t xml:space="preserve">Corporate L&amp;D departments evaluate authoring tools based on speed to deployment and integration with existing Learning Management Systems (LMS). Competitors like Articulate 360 charge approximately $1,400 annually per user, while newer AI entrants like Coursebox charge between $30 and $100 monthly for individual creators [3]. Corporate buyers are willing to pay premium prices for advanced features such as branching scenarios, high-fidelity SCORM exports, and robust analytics. The primary constraint in this market is not budget, but perceived value and enterprise security compliance.</w:t>
+        <w:t xml:space="preserve">Corporate L&amp;D departments evaluate authoring tools based on speed to deployment, integration with existing Learning Management Systems (LMS), and the professional polish of the final product. Competitors like Articulate 360 charge approximately $1,400 annually per user, while newer AI entrants like Coursebox charge between $30 and $100 monthly for individual creators [3]. Corporate buyers are willing to pay premium prices for advanced features such as branching scenarios, high-fidelity SCORM exports, robust analytics, and natural-sounding AI voice-overs. The primary constraint in this market is not budget, but perceived value and enterprise security compliance.</w:t>
       </w:r>
     </w:p>
     <w:p>
@@ -210,7 +210,7 @@
         <w:t xml:space="preserve">Education (K-12)</w:t>
       </w:r>
       <w:r>
-        <w:t xml:space="preserve">. Both tracks operate on the foundational credit system established in the original strategy, but the subscription prices, included features, and credit allotments differ significantly.</w:t>
+        <w:t xml:space="preserve">. Both tracks operate on the foundational credit system, but the subscription prices, included features, and credit allotments differ significantly to account for the inclusion of TTS capabilities.</w:t>
       </w:r>
     </w:p>
     <w:p>
@@ -233,7 +233,7 @@
         <w:pStyle w:val="MdParagraph"/>
       </w:pPr>
       <w:r>
-        <w:t xml:space="preserve">This track is designed for rapid adoption. It assumes that teachers have virtually zero budget for software but possess immense influence over district purchasing decisions.</w:t>
+        <w:t xml:space="preserve">This track is designed for rapid adoption. It assumes that teachers have virtually zero budget for software but possess immense influence over district purchasing decisions. TTS is introduced as a premium capability to drive upgrades to the Pro tier.</w:t>
       </w:r>
     </w:p>
     <w:p>
@@ -487,7 +487,15 @@
               <w:jc w:val="left"/>
             </w:pPr>
             <w:r>
-              <w:t xml:space="preserve">Basic AI course generation (Quick Overview &amp; Standard), standard K-12 templates, watermarked exports, community support.</w:t>
+              <w:t xml:space="preserve">Basic AI course generation (Quick Overview &amp; Standard), standard K-12 templates, watermarked exports. </w:t>
+            </w:r>
+            <w:r>
+              <w:rPr>
+                <w:rStyle w:val="MdEm"/>
+                <w:i/>
+                <w:iCs/>
+              </w:rPr>
+              <w:t xml:space="preserve">No TTS Audio.</w:t>
             </w:r>
           </w:p>
         </w:tc>
@@ -604,7 +612,15 @@
               <w:jc w:val="left"/>
             </w:pPr>
             <w:r>
-              <w:t xml:space="preserve">Full AI generation (including Comprehensive Units), advanced game templates (Escape Room, Jeopardy), no watermarks, LMS integration (Canvas/Google Classroom).</w:t>
+              <w:t xml:space="preserve">Full AI generation (including Comprehensive Units), advanced game templates, no watermarks, LMS integration. </w:t>
+            </w:r>
+            <w:r>
+              <w:rPr>
+                <w:rStyle w:val="MdEm"/>
+                <w:i/>
+                <w:iCs/>
+              </w:rPr>
+              <w:t xml:space="preserve">Includes Standard TTS Audio.</w:t>
             </w:r>
           </w:p>
         </w:tc>
@@ -732,7 +748,15 @@
               <w:jc w:val="left"/>
             </w:pPr>
             <w:r>
-              <w:t xml:space="preserve">SSO/Rostering (Clever, ClassLink), admin dashboards, shared curriculum libraries, custom data privacy agreements (FERPA/COPPA compliant), dedicated success manager.</w:t>
+              <w:t xml:space="preserve">SSO/Rostering, admin dashboards, shared curriculum libraries, custom data privacy agreements. </w:t>
+            </w:r>
+            <w:r>
+              <w:rPr>
+                <w:rStyle w:val="MdEm"/>
+                <w:i/>
+                <w:iCs/>
+              </w:rPr>
+              <w:t xml:space="preserve">Includes HD TTS Audio &amp; Voice Cloning options.</w:t>
             </w:r>
           </w:p>
         </w:tc>
@@ -751,7 +775,7 @@
         <w:t xml:space="preserve">Strategic Rationale for K-12:</w:t>
       </w:r>
       <w:r>
-        <w:t xml:space="preserve"> The $12/month price point for Teacher Pro aligns perfectly with the established ceiling for teacher out-of-pocket spending, mirroring successful tools like MagicSchool AI [6]. The generous 300 credits allow a teacher to generate several comprehensive units per month. The true revenue engine is the School/District tier, which should be priced dynamically based on student enrollment (typically $2 to $5 per student annually) rather than per-teacher licensing, as this aligns with how districts calculate funding [1].</w:t>
+        <w:t xml:space="preserve"> The $12/month price point for Teacher Pro aligns perfectly with the established ceiling for teacher out-of-pocket spending, mirroring successful tools like MagicSchool AI [6]. The generous 300 credits allow a teacher to generate several comprehensive units per month. By restricting TTS audio to the paid tiers, the platform creates a compelling upgrade trigger for teachers who want to create accessible, read-aloud content for younger students or diverse learners. The true revenue engine remains the School/District tier, priced dynamically based on student enrollment [1].</w:t>
       </w:r>
     </w:p>
     <w:p>
@@ -774,7 +798,7 @@
         <w:pStyle w:val="MdParagraph"/>
       </w:pPr>
       <w:r>
-        <w:t xml:space="preserve">This track retains the structure of the original pricing strategy, designed to maximize revenue from professional instructional designers and corporate L&amp;D teams who require high-volume generation and advanced SCORM capabilities.</w:t>
+        <w:t xml:space="preserve">This track is designed to maximize revenue from professional instructional designers and corporate L&amp;D teams who require high-volume generation, advanced SCORM capabilities, and professional-grade audio narration.</w:t>
       </w:r>
     </w:p>
     <w:p>
@@ -1028,7 +1052,15 @@
               <w:jc w:val="left"/>
             </w:pPr>
             <w:r>
-              <w:t xml:space="preserve">Full AI generation, all interactive templates, SCORM 1.2/2004 exports, premium support.</w:t>
+              <w:t xml:space="preserve">Full AI generation, all interactive templates, SCORM 1.2/2004 exports, premium support. </w:t>
+            </w:r>
+            <w:r>
+              <w:rPr>
+                <w:rStyle w:val="MdEm"/>
+                <w:i/>
+                <w:iCs/>
+              </w:rPr>
+              <w:t xml:space="preserve">Includes Standard &amp; HD TTS Audio.</w:t>
             </w:r>
           </w:p>
         </w:tc>
@@ -1145,7 +1177,15 @@
               <w:jc w:val="left"/>
             </w:pPr>
             <w:r>
-              <w:t xml:space="preserve">Team collaboration, shared asset libraries, brand kit management, advanced analytics, priority support.</w:t>
+              <w:t xml:space="preserve">Team collaboration, shared asset libraries, brand kit management, advanced analytics. </w:t>
+            </w:r>
+            <w:r>
+              <w:rPr>
+                <w:rStyle w:val="MdEm"/>
+                <w:i/>
+                <w:iCs/>
+              </w:rPr>
+              <w:t xml:space="preserve">Includes HD TTS Audio &amp; Basic Voice Cloning.</w:t>
             </w:r>
           </w:p>
         </w:tc>
@@ -1273,7 +1313,15 @@
               <w:jc w:val="left"/>
             </w:pPr>
             <w:r>
-              <w:t xml:space="preserve">Custom AI model training, advanced security (SOC2), API access, dedicated account manager.</w:t>
+              <w:t xml:space="preserve">Custom AI model training, advanced security (SOC2), API access, dedicated account manager. </w:t>
+            </w:r>
+            <w:r>
+              <w:rPr>
+                <w:rStyle w:val="MdEm"/>
+                <w:i/>
+                <w:iCs/>
+              </w:rPr>
+              <w:t xml:space="preserve">Unlimited HD TTS &amp; Enterprise Voice Cloning.</w:t>
             </w:r>
           </w:p>
         </w:tc>
@@ -1292,7 +1340,7 @@
         <w:t xml:space="preserve">Strategic Rationale for Corporate:</w:t>
       </w:r>
       <w:r>
-        <w:t xml:space="preserve"> The $79/month starting price positions the tool as a premium, high-ROI investment that remains significantly cheaper than legacy tools like Articulate 360. The credit allotments are higher here because corporate courses (especially "Comprehensive Courses" using ABCD objectives and complex branching) consume significantly more AI tokens than K-12 lessons.</w:t>
+        <w:t xml:space="preserve"> The $79/month starting price positions the tool as a premium, high-ROI investment that remains significantly cheaper than legacy tools like Articulate 360. The credit allotments are higher here because corporate courses (especially "Comprehensive Courses" using ABCD objectives, complex branching, and full HD audio narration) consume significantly more AI tokens and TTS API calls than K-12 lessons. The inclusion of HD audio and voice cloning at higher tiers serves as a powerful differentiator.</w:t>
       </w:r>
     </w:p>
     <w:p>
@@ -1315,7 +1363,7 @@
         <w:pStyle w:val="MdParagraph"/>
       </w:pPr>
       <w:r>
-        <w:t xml:space="preserve">The core mechanism for managing the variable costs of Large Language Models (LLMs) remains the credit system. By abstracting API token costs into "credits," the platform ensures profitability regardless of how users interact with the AI.</w:t>
+        <w:t xml:space="preserve">The core mechanism for managing the variable costs of Large Language Models (LLMs) and Text-to-Speech (TTS) APIs remains the credit system. By abstracting API costs into "credits," the platform ensures profitability regardless of how users interact with the AI.</w:t>
       </w:r>
     </w:p>
     <w:p>
@@ -1338,7 +1386,7 @@
         <w:pStyle w:val="MdParagraph"/>
       </w:pPr>
       <w:r>
-        <w:t xml:space="preserve">The cost of generation must scale with the complexity of the output. The K-12 specific features (such as generating "I Can" statements or modifying reading levels) require distinct credit mapping.</w:t>
+        <w:t xml:space="preserve">The cost of generation must scale with the complexity of the output and the utilization of expensive APIs like OpenAI's TTS. Audio generation is significantly more expensive than text generation and must be priced accordingly in the credit economy.</w:t>
       </w:r>
     </w:p>
     <w:p>
@@ -1510,7 +1558,7 @@
               <w:jc w:val="left"/>
             </w:pPr>
             <w:r>
-              <w:t xml:space="preserve">Low complexity; short prompt; minimal slide generation.</w:t>
+              <w:t xml:space="preserve">Low complexity text generation; minimal slide generation.</w:t>
             </w:r>
           </w:p>
         </w:tc>
@@ -1587,7 +1635,7 @@
               <w:jc w:val="left"/>
             </w:pPr>
             <w:r>
-              <w:t xml:space="preserve">Medium complexity; standard objectives; basic interactive elements.</w:t>
+              <w:t xml:space="preserve">Medium complexity text generation; standard objectives.</w:t>
             </w:r>
           </w:p>
         </w:tc>
@@ -1664,7 +1712,7 @@
               <w:jc w:val="left"/>
             </w:pPr>
             <w:r>
-              <w:t xml:space="preserve">High complexity; deep curriculum alignment; advanced interactions (branching, escape rooms).</w:t>
+              <w:t xml:space="preserve">High complexity text generation; deep curriculum alignment; advanced interactions.</w:t>
             </w:r>
           </w:p>
         </w:tc>
@@ -1698,27 +1746,27 @@
                 <w:b/>
                 <w:bCs/>
               </w:rPr>
-              <w:t xml:space="preserve">File Import (PPT, PDF to Course)</w:t>
-            </w:r>
-          </w:p>
-        </w:tc>
-        <w:tc>
-          <w:tcPr>
-            <w:tcMar>
-              <w:top w:type="dxa" w:w="80"/>
-              <w:left w:type="dxa" w:w="120"/>
-              <w:bottom w:type="dxa" w:w="80"/>
-              <w:right w:type="dxa" w:w="120"/>
-            </w:tcMar>
-            <w:vAlign w:val="center"/>
-          </w:tcPr>
-          <w:p>
-            <w:pPr>
-              <w:pStyle w:val="MdTableCell"/>
-              <w:jc w:val="left"/>
-            </w:pPr>
-            <w:r>
-              <w:t xml:space="preserve">40 Credits</w:t>
+              <w:t xml:space="preserve">Generate Standard TTS Audio (Per Slide)</w:t>
+            </w:r>
+          </w:p>
+        </w:tc>
+        <w:tc>
+          <w:tcPr>
+            <w:tcMar>
+              <w:top w:type="dxa" w:w="80"/>
+              <w:left w:type="dxa" w:w="120"/>
+              <w:bottom w:type="dxa" w:w="80"/>
+              <w:right w:type="dxa" w:w="120"/>
+            </w:tcMar>
+            <w:vAlign w:val="center"/>
+          </w:tcPr>
+          <w:p>
+            <w:pPr>
+              <w:pStyle w:val="MdTableCell"/>
+              <w:jc w:val="left"/>
+            </w:pPr>
+            <w:r>
+              <w:t xml:space="preserve">5 Credits</w:t>
             </w:r>
           </w:p>
         </w:tc>
@@ -1741,7 +1789,17 @@
               <w:jc w:val="left"/>
             </w:pPr>
             <w:r>
-              <w:t xml:space="preserve">Requires OCR/parsing and extensive AI structuring before generation.</w:t>
+              <w:t xml:space="preserve">Calls standard TTS API (e.g., OpenAI </w:t>
+            </w:r>
+            <w:r>
+              <w:rPr>
+                <w:rStyle w:val="MdCode"/>
+                <w:u w:val="single"/>
+              </w:rPr>
+              <w:t xml:space="preserve">tts-1</w:t>
+            </w:r>
+            <w:r>
+              <w:t xml:space="preserve">); moderate API cost.</w:t>
             </w:r>
           </w:p>
         </w:tc>
@@ -1775,27 +1833,27 @@
                 <w:b/>
                 <w:bCs/>
               </w:rPr>
-              <w:t xml:space="preserve">Differentiate Reading Level</w:t>
-            </w:r>
-          </w:p>
-        </w:tc>
-        <w:tc>
-          <w:tcPr>
-            <w:tcMar>
-              <w:top w:type="dxa" w:w="80"/>
-              <w:left w:type="dxa" w:w="120"/>
-              <w:bottom w:type="dxa" w:w="80"/>
-              <w:right w:type="dxa" w:w="120"/>
-            </w:tcMar>
-            <w:vAlign w:val="center"/>
-          </w:tcPr>
-          <w:p>
-            <w:pPr>
-              <w:pStyle w:val="MdTableCell"/>
-              <w:jc w:val="left"/>
-            </w:pPr>
-            <w:r>
-              <w:t xml:space="preserve">15 Credits</w:t>
+              <w:t xml:space="preserve">Generate HD TTS Audio (Per Slide)</w:t>
+            </w:r>
+          </w:p>
+        </w:tc>
+        <w:tc>
+          <w:tcPr>
+            <w:tcMar>
+              <w:top w:type="dxa" w:w="80"/>
+              <w:left w:type="dxa" w:w="120"/>
+              <w:bottom w:type="dxa" w:w="80"/>
+              <w:right w:type="dxa" w:w="120"/>
+            </w:tcMar>
+            <w:vAlign w:val="center"/>
+          </w:tcPr>
+          <w:p>
+            <w:pPr>
+              <w:pStyle w:val="MdTableCell"/>
+              <w:jc w:val="left"/>
+            </w:pPr>
+            <w:r>
+              <w:t xml:space="preserve">10 Credits</w:t>
             </w:r>
           </w:p>
         </w:tc>
@@ -1818,7 +1876,17 @@
               <w:jc w:val="left"/>
             </w:pPr>
             <w:r>
-              <w:t xml:space="preserve">Specific to K-12; requires rewriting existing content for different Lexile levels.</w:t>
+              <w:t xml:space="preserve">Calls high-definition TTS API (e.g., OpenAI </w:t>
+            </w:r>
+            <w:r>
+              <w:rPr>
+                <w:rStyle w:val="MdCode"/>
+                <w:u w:val="single"/>
+              </w:rPr>
+              <w:t xml:space="preserve">tts-1-hd</w:t>
+            </w:r>
+            <w:r>
+              <w:t xml:space="preserve">); higher API cost.</w:t>
             </w:r>
           </w:p>
         </w:tc>
@@ -1832,6 +1900,160 @@
           <w:tcPr>
             <w:tcBorders>
               <w:left w:val="none"/>
+            </w:tcBorders>
+            <w:tcMar>
+              <w:top w:type="dxa" w:w="80"/>
+              <w:left w:type="dxa" w:w="120"/>
+              <w:bottom w:type="dxa" w:w="80"/>
+              <w:right w:type="dxa" w:w="120"/>
+            </w:tcMar>
+            <w:vAlign w:val="center"/>
+          </w:tcPr>
+          <w:p>
+            <w:pPr>
+              <w:pStyle w:val="MdTableCell"/>
+              <w:jc w:val="left"/>
+            </w:pPr>
+            <w:r>
+              <w:rPr>
+                <w:rStyle w:val="MdStrong"/>
+                <w:b/>
+                <w:bCs/>
+              </w:rPr>
+              <w:t xml:space="preserve">Generate Custom Voice Clone Audio (Per Slide)</w:t>
+            </w:r>
+          </w:p>
+        </w:tc>
+        <w:tc>
+          <w:tcPr>
+            <w:tcMar>
+              <w:top w:type="dxa" w:w="80"/>
+              <w:left w:type="dxa" w:w="120"/>
+              <w:bottom w:type="dxa" w:w="80"/>
+              <w:right w:type="dxa" w:w="120"/>
+            </w:tcMar>
+            <w:vAlign w:val="center"/>
+          </w:tcPr>
+          <w:p>
+            <w:pPr>
+              <w:pStyle w:val="MdTableCell"/>
+              <w:jc w:val="left"/>
+            </w:pPr>
+            <w:r>
+              <w:t xml:space="preserve">20 Credits</w:t>
+            </w:r>
+          </w:p>
+        </w:tc>
+        <w:tc>
+          <w:tcPr>
+            <w:tcBorders>
+              <w:right w:val="none"/>
+            </w:tcBorders>
+            <w:tcMar>
+              <w:top w:type="dxa" w:w="80"/>
+              <w:left w:type="dxa" w:w="120"/>
+              <w:bottom w:type="dxa" w:w="80"/>
+              <w:right w:type="dxa" w:w="120"/>
+            </w:tcMar>
+            <w:vAlign w:val="center"/>
+          </w:tcPr>
+          <w:p>
+            <w:pPr>
+              <w:pStyle w:val="MdTableCell"/>
+              <w:jc w:val="left"/>
+            </w:pPr>
+            <w:r>
+              <w:t xml:space="preserve">Utilizes premium voice cloning APIs; highest API cost and processing time.</w:t>
+            </w:r>
+          </w:p>
+        </w:tc>
+      </w:tr>
+      <w:tr>
+        <w:trPr>
+          <w:cantSplit/>
+          <w:trHeight w:val="576" w:hRule="atLeast"/>
+        </w:trPr>
+        <w:tc>
+          <w:tcPr>
+            <w:tcBorders>
+              <w:left w:val="none"/>
+            </w:tcBorders>
+            <w:tcMar>
+              <w:top w:type="dxa" w:w="80"/>
+              <w:left w:type="dxa" w:w="120"/>
+              <w:bottom w:type="dxa" w:w="80"/>
+              <w:right w:type="dxa" w:w="120"/>
+            </w:tcMar>
+            <w:vAlign w:val="center"/>
+          </w:tcPr>
+          <w:p>
+            <w:pPr>
+              <w:pStyle w:val="MdTableCell"/>
+              <w:jc w:val="left"/>
+            </w:pPr>
+            <w:r>
+              <w:rPr>
+                <w:rStyle w:val="MdStrong"/>
+                <w:b/>
+                <w:bCs/>
+              </w:rPr>
+              <w:t xml:space="preserve">File Import (PPT, PDF to Course)</w:t>
+            </w:r>
+          </w:p>
+        </w:tc>
+        <w:tc>
+          <w:tcPr>
+            <w:tcMar>
+              <w:top w:type="dxa" w:w="80"/>
+              <w:left w:type="dxa" w:w="120"/>
+              <w:bottom w:type="dxa" w:w="80"/>
+              <w:right w:type="dxa" w:w="120"/>
+            </w:tcMar>
+            <w:vAlign w:val="center"/>
+          </w:tcPr>
+          <w:p>
+            <w:pPr>
+              <w:pStyle w:val="MdTableCell"/>
+              <w:jc w:val="left"/>
+            </w:pPr>
+            <w:r>
+              <w:t xml:space="preserve">40 Credits</w:t>
+            </w:r>
+          </w:p>
+        </w:tc>
+        <w:tc>
+          <w:tcPr>
+            <w:tcBorders>
+              <w:right w:val="none"/>
+            </w:tcBorders>
+            <w:tcMar>
+              <w:top w:type="dxa" w:w="80"/>
+              <w:left w:type="dxa" w:w="120"/>
+              <w:bottom w:type="dxa" w:w="80"/>
+              <w:right w:type="dxa" w:w="120"/>
+            </w:tcMar>
+            <w:vAlign w:val="center"/>
+          </w:tcPr>
+          <w:p>
+            <w:pPr>
+              <w:pStyle w:val="MdTableCell"/>
+              <w:jc w:val="left"/>
+            </w:pPr>
+            <w:r>
+              <w:t xml:space="preserve">Requires OCR/parsing and extensive AI structuring before generation.</w:t>
+            </w:r>
+          </w:p>
+        </w:tc>
+      </w:tr>
+      <w:tr>
+        <w:trPr>
+          <w:cantSplit/>
+          <w:trHeight w:val="576" w:hRule="atLeast"/>
+        </w:trPr>
+        <w:tc>
+          <w:tcPr>
+            <w:tcBorders>
+              <w:left w:val="none"/>
               <w:bottom w:val="single" w:color="E1E4E8" w:sz="4"/>
             </w:tcBorders>
             <w:tcMar>
@@ -1900,7 +2122,7 @@
               <w:jc w:val="left"/>
             </w:pPr>
             <w:r>
-              <w:t xml:space="preserve">Requires specific structured JSON output (e.g., Jeopardy board, Family Feud synonyms).</w:t>
+              <w:t xml:space="preserve">Requires specific structured JSON output (e.g., Jeopardy board).</w:t>
             </w:r>
           </w:p>
         </w:tc>
@@ -1908,6 +2130,25 @@
     </w:tbl>
     <w:p>
       <w:pPr>
+        <w:pStyle w:val="MdParagraph"/>
+      </w:pPr>
+      <w:r>
+        <w:rPr>
+          <w:rStyle w:val="MdEm"/>
+          <w:i/>
+          <w:iCs/>
+        </w:rPr>
+        <w:t xml:space="preserve">Note: A 15-slide Standard Training course with Standard TTS audio on every slide would cost 50 credits (base generation) + 75 credits (15 slides * 5 credits/slide for audio) = 125 credits total.</w:t>
+      </w:r>
+    </w:p>
+    <w:p>
+      <w:pPr>
+        <w:pStyle w:val="MdSpace"/>
+        <w:spacing w:before="0" w:after="60"/>
+      </w:pPr>
+    </w:p>
+    <w:p>
+      <w:pPr>
         <w:pStyle w:val="Heading3"/>
         <w:pStyle w:val="MdHeading3"/>
       </w:pPr>
@@ -1920,7 +2161,7 @@
         <w:pStyle w:val="MdParagraph"/>
       </w:pPr>
       <w:r>
-        <w:t xml:space="preserve">When users exhaust their monthly subscription credits, they must have a frictionless path to purchase more. This is vital for capturing revenue during peak creation seasons (e.g., back-to-school prep in August, or end-of-year corporate compliance training).</w:t>
+        <w:t xml:space="preserve">When users exhaust their monthly subscription credits—which will happen more frequently with the introduction of credit-intensive TTS features—they must have a frictionless path to purchase more. This is vital for capturing revenue during peak creation seasons.</w:t>
       </w:r>
     </w:p>
     <w:p>
@@ -1980,7 +2221,7 @@
         <w:pStyle w:val="MdParagraph"/>
       </w:pPr>
       <w:r>
-        <w:t xml:space="preserve">Assuming 1 credit covers approximately 10,000 tokens (input and output) using a model like GPT-4o, a 100-credit Comprehensive Course utilizes roughly 1,000,000 tokens. At estimated API costs of $5/1M input and $15/1M output, the hard cost is approximately $10. Selling those 100 credits for $25 yields a strong 60% gross margin on pure usage, independent of the subscription base fee.</w:t>
+        <w:t xml:space="preserve">With TTS integration, the platform's API costs increase. Assuming OpenAI TTS pricing of $15 per 1M characters (Standard) and $30 per 1M characters (HD), the credit system ensures that the platform maintains a strong gross margin (estimated 50-60%) even when users heavily utilize audio generation.</w:t>
       </w:r>
     </w:p>
     <w:p>
@@ -2003,7 +2244,7 @@
         <w:pStyle w:val="MdParagraph"/>
       </w:pPr>
       <w:r>
-        <w:t xml:space="preserve">To successfully deploy this bifurcated pricing model, several operational and marketing strategies must be implemented.</w:t>
+        <w:t xml:space="preserve">To successfully deploy this bifurcated pricing model with TTS integration, several operational and marketing strategies must be implemented.</w:t>
       </w:r>
     </w:p>
     <w:p>
@@ -2086,7 +2327,7 @@
         <w:t xml:space="preserve">Feature Gating:</w:t>
       </w:r>
       <w:r>
-        <w:t xml:space="preserve"> Restrict high-value corporate features (such as SCORM 2004 export, corporate brand kits, and specific corporate templates) exclusively to the Corporate track. The Education track should export primarily to LMS formats used in K-12 (Canvas, Schoology, Google Classroom) or standard web formats.</w:t>
+        <w:t xml:space="preserve"> Restrict high-value corporate features (such as SCORM 2004 export, corporate brand kits, and HD/Voice Clone audio options) exclusively to the Corporate track or higher Education tiers.</w:t>
       </w:r>
     </w:p>
     <w:p>
@@ -2101,7 +2342,7 @@
         <w:pStyle w:val="MdHeading3"/>
       </w:pPr>
       <w:r>
-        <w:t xml:space="preserve">5.2 Leverage the K-12 Freemium Funnel</w:t>
+        <w:t xml:space="preserve">5.2 Position TTS as an Accessibility and Engagement Driver</w:t>
       </w:r>
     </w:p>
     <w:p>
@@ -2109,7 +2350,18 @@
         <w:pStyle w:val="MdParagraph"/>
       </w:pPr>
       <w:r>
-        <w:t xml:space="preserve">The "Teacher Free" tier is not a loss leader; it is a lead generation engine. The platform must actively track when multiple teachers from the same school domain sign up for free accounts. When usage from a single domain reaches a critical mass (e.g., 5+ active teachers), this triggers an automated sales sequence targeting the school's principal or district IT director to pitch a site license.</w:t>
+        <w:t xml:space="preserve">In the K-12 market, market TTS audio not just as a convenience, but as a critical </w:t>
+      </w:r>
+      <w:r>
+        <w:rPr>
+          <w:rStyle w:val="MdStrong"/>
+          <w:b/>
+          <w:bCs/>
+        </w:rPr>
+        <w:t xml:space="preserve">Universal Design for Learning (UDL)</w:t>
+      </w:r>
+      <w:r>
+        <w:t xml:space="preserve"> and accessibility feature. Audio narration supports early readers, English Language Learners (ELLs), and students with IEPs. This positioning makes the Teacher Pro subscription highly justifiable and supports district-wide enterprise sales pitches.</w:t>
       </w:r>
     </w:p>
     <w:p>
@@ -2124,7 +2376,7 @@
         <w:pStyle w:val="MdHeading3"/>
       </w:pPr>
       <w:r>
-        <w:t xml:space="preserve">5.3 Align with Educational Buying Cycles</w:t>
+        <w:t xml:space="preserve">5.3 Leverage the K-12 Freemium Funnel</w:t>
       </w:r>
     </w:p>
     <w:p>
@@ -2132,7 +2384,7 @@
         <w:pStyle w:val="MdParagraph"/>
       </w:pPr>
       <w:r>
-        <w:t xml:space="preserve">Corporate purchasing happens year-round, but K-12 purchasing is highly cyclical. Marketing efforts for School/District enterprise plans must peak between March and June, when districts finalize budgets for the upcoming academic year. Furthermore, ensure the platform's marketing materials highlight how the tool can be purchased using federal ESSER (if applicable/remaining) or Title I funds, as this dramatically reduces friction for district buyers [8].</w:t>
+        <w:t xml:space="preserve">The "Teacher Free" tier is a lead generation engine. By omitting TTS audio from the free tier, teachers are incentivized to upgrade to Pro to unlock read-aloud capabilities for their students. When usage from a single domain reaches a critical mass (e.g., 5+ active teachers), this triggers an automated sales sequence targeting the school's principal or district IT director to pitch a site license.</w:t>
       </w:r>
     </w:p>
     <w:p>
@@ -2157,7 +2409,7 @@
       <w:r>
         <w:t xml:space="preserve">[1] Monetizely. "EdTech Pricing Models: Monetizing Education Technology Effectively." </w:t>
       </w:r>
-      <w:hyperlink w:history="1" r:id="rIdtkksxzdxrlnw5xjq7_ngf">
+      <w:hyperlink w:history="1" r:id="rIdy4zlafmopvj_hxvdutofw">
         <w:r>
           <w:rPr>
             <w:rStyle w:val="MdLink"/>
@@ -2172,7 +2424,7 @@
         <w:br/>
         <w:t xml:space="preserve">[3] Coursebox. "AI Course Creator &amp; LMS Pricing."</w:t>
       </w:r>
-      <w:hyperlink w:history="1" r:id="rIdictvzwo1qpaibkgyviweh">
+      <w:hyperlink w:history="1" r:id="rIdf0rcz-cg5nfzt1ztxbvxf">
         <w:r>
           <w:rPr>
             <w:rStyle w:val="MdLink"/>
@@ -2184,7 +2436,7 @@
         <w:t xml:space="preserve">
 [4] AdoptAClassroom.org. "2025 Teacher Spending Survey." </w:t>
       </w:r>
-      <w:hyperlink w:history="1" r:id="rId5hmdt1e6zyun-wdfhqaxa">
+      <w:hyperlink w:history="1" r:id="rId_j71wziyjtudmhohcxnnd">
         <w:r>
           <w:rPr>
             <w:rStyle w:val="MdLink"/>
@@ -2196,7 +2448,7 @@
         <w:t xml:space="preserve">
 [5] Edugenius. "AI Education Tools Under $10/Month — Budget-Friendly Options 2026." </w:t>
       </w:r>
-      <w:hyperlink w:history="1" r:id="rIden4ie8sfo-qltgjn-e-2k">
+      <w:hyperlink w:history="1" r:id="rIdtur2bq2vx8pcobu2x91vf">
         <w:r>
           <w:rPr>
             <w:rStyle w:val="MdLink"/>
@@ -2208,7 +2460,7 @@
         <w:t xml:space="preserve">
 [6] MagicSchool AI. "MagicSchool Pricing &amp; Plans." </w:t>
       </w:r>
-      <w:hyperlink w:history="1" r:id="rId8mm_oinkwlohmrq4etc5s">
+      <w:hyperlink w:history="1" r:id="rIdounquzybhd3thuo4j6hc2">
         <w:r>
           <w:rPr>
             <w:rStyle w:val="MdLink"/>
@@ -2220,7 +2472,7 @@
         <w:t xml:space="preserve">
 [7] Nearpod. "Pricing Plans and Comparison." </w:t>
       </w:r>
-      <w:hyperlink w:history="1" r:id="rIdwrwhifirhlt7nrtchf98f">
+      <w:hyperlink w:history="1" r:id="rIdt9kmt7puzxq7pxzthxa9j">
         <w:r>
           <w:rPr>
             <w:rStyle w:val="MdLink"/>
@@ -2232,7 +2484,7 @@
         <w:t xml:space="preserve">
 [8] EdTech Magazine. "K–12 Education Grant Funding Guide for 2026." </w:t>
       </w:r>
-      <w:hyperlink w:history="1" r:id="rId664b0ylwgnvsz5zbd50bi">
+      <w:hyperlink w:history="1" r:id="rIdlwfeiqrzfy2z5mgxbzvym">
         <w:r>
           <w:rPr>
             <w:rStyle w:val="MdLink"/>

</xml_diff>